<commit_message>
Use AIC-specific comparative statement format, add sample reference
When a PR's primary entity is AIC Developmental Foundation, the
downloadable comparative statement boilerplate is now the AIC-specific
version instead of the default one. Same upload/attach flow either
way — only which file gets linked changes.

Also updates the default boilerplate to a newer version, and adds an
always-visible "view sample" link (opens in a new tab) showing a
filled-in reference comparative statement alongside the blank
downloadable format, regardless of entity.

Co-Authored-By: Claude Sonnet 5 <noreply@anthropic.com>
</commit_message>
<xml_diff>
--- a/public/comparative-statement-boilerplate.docx
+++ b/public/comparative-statement-boilerplate.docx
@@ -409,13 +409,6 @@
           <w:szCs w:val="20"/>
         </w:rPr>
         <w:br/>
-      </w:r>
-      <w:r>
-        <w:rPr>
-          <w:rFonts w:ascii="Montserrat" w:eastAsia="Montserrat" w:hAnsi="Montserrat" w:cs="Montserrat"/>
-          <w:sz w:val="20"/>
-          <w:szCs w:val="20"/>
-        </w:rPr>
         <w:t>&lt;Please fill in details here&gt;</w:t>
       </w:r>
     </w:p>
@@ -572,12 +565,24 @@
           <w:sz w:val="20"/>
           <w:szCs w:val="20"/>
         </w:rPr>
-        <w:t>Program, balancing affordability, quality, and operational efficiency. This selection supports the program’s objective of delivering immediate, high-impact vision correction to underserved communities while ensuring responsible use of program funds and adherence to quality standards.</w:t>
+        <w:t>Progra</w:t>
+      </w:r>
+      <w:r>
+        <w:rPr>
+          <w:rFonts w:ascii="Montserrat" w:eastAsia="Montserrat" w:hAnsi="Montserrat" w:cs="Montserrat"/>
+          <w:sz w:val="20"/>
+          <w:szCs w:val="20"/>
+        </w:rPr>
+        <w:t>m &lt;justify the rationale here&gt;</w:t>
       </w:r>
     </w:p>
     <w:sectPr>
-      <w:headerReference w:type="default" r:id="rId8"/>
-      <w:footerReference w:type="default" r:id="rId9"/>
+      <w:headerReference w:type="even" r:id="rId8"/>
+      <w:headerReference w:type="default" r:id="rId9"/>
+      <w:footerReference w:type="even" r:id="rId10"/>
+      <w:footerReference w:type="default" r:id="rId11"/>
+      <w:headerReference w:type="first" r:id="rId12"/>
+      <w:footerReference w:type="first" r:id="rId13"/>
       <w:pgSz w:w="12240" w:h="15840"/>
       <w:pgMar w:top="1440" w:right="1440" w:bottom="1440" w:left="1440" w:header="900" w:footer="510" w:gutter="0"/>
       <w:pgNumType w:start="1"/>
@@ -616,6 +621,16 @@
 <w:ftr xmlns:wpc="http://schemas.microsoft.com/office/word/2010/wordprocessingCanvas" xmlns:cx="http://schemas.microsoft.com/office/drawing/2014/chartex" xmlns:cx1="http://schemas.microsoft.com/office/drawing/2015/9/8/chartex" xmlns:cx2="http://schemas.microsoft.com/office/drawing/2015/10/21/chartex" xmlns:cx3="http://schemas.microsoft.com/office/drawing/2016/5/9/chartex" xmlns:cx4="http://schemas.microsoft.com/office/drawing/2016/5/10/chartex" xmlns:cx5="http://schemas.microsoft.com/office/drawing/2016/5/11/chartex" xmlns:cx6="http://schemas.microsoft.com/office/drawing/2016/5/12/chartex" xmlns:cx7="http://schemas.microsoft.com/office/drawing/2016/5/13/chartex" xmlns:cx8="http://schemas.microsoft.com/office/drawing/2016/5/14/chartex" xmlns:mc="http://schemas.openxmlformats.org/markup-compatibility/2006" xmlns:aink="http://schemas.microsoft.com/office/drawing/2016/ink" xmlns:am3d="http://schemas.microsoft.com/office/drawing/2017/model3d" xmlns:o="urn:schemas-microsoft-com:office:office" xmlns:oel="http://schemas.microsoft.com/office/2019/extlst" xmlns:r="http://schemas.openxmlformats.org/officeDocument/2006/relationships" xmlns:m="http://schemas.openxmlformats.org/officeDocument/2006/math" xmlns:v="urn:schemas-microsoft-com:vml" xmlns:wp14="http://schemas.microsoft.com/office/word/2010/wordprocessingDrawing" xmlns:wp="http://schemas.openxmlformats.org/drawingml/2006/wordprocessingDrawing" xmlns:w10="urn:schemas-microsoft-com:office:word" xmlns:w="http://schemas.openxmlformats.org/wordprocessingml/2006/main" xmlns:w14="http://schemas.microsoft.com/office/word/2010/wordml" xmlns:w15="http://schemas.microsoft.com/office/word/2012/wordml" xmlns:w16cex="http://schemas.microsoft.com/office/word/2018/wordml/cex" xmlns:w16cid="http://schemas.microsoft.com/office/word/2016/wordml/cid" xmlns:w16="http://schemas.microsoft.com/office/word/2018/wordml" xmlns:w16du="http://schemas.microsoft.com/office/word/2023/wordml/word16du" xmlns:w16sdtdh="http://schemas.microsoft.com/office/word/2020/wordml/sdtdatahash" xmlns:w16sdtfl="http://schemas.microsoft.com/office/word/2024/wordml/sdtformatlock" xmlns:w16se="http://schemas.microsoft.com/office/word/2015/wordml/symex" xmlns:wpg="http://schemas.microsoft.com/office/word/2010/wordprocessingGroup" xmlns:wpi="http://schemas.microsoft.com/office/word/2010/wordprocessingInk" xmlns:wne="http://schemas.microsoft.com/office/word/2006/wordml" xmlns:wps="http://schemas.microsoft.com/office/word/2010/wordprocessingShape" mc:Ignorable="w14 w15 w16se w16cid w16 w16cex w16sdtdh w16sdtfl w16du wp14">
   <w:p>
     <w:pPr>
+      <w:pStyle w:val="Footer"/>
+    </w:pPr>
+  </w:p>
+</w:ftr>
+</file>
+
+<file path=word/footer2.xml><?xml version="1.0" encoding="utf-8"?>
+<w:ftr xmlns:wpc="http://schemas.microsoft.com/office/word/2010/wordprocessingCanvas" xmlns:cx="http://schemas.microsoft.com/office/drawing/2014/chartex" xmlns:cx1="http://schemas.microsoft.com/office/drawing/2015/9/8/chartex" xmlns:cx2="http://schemas.microsoft.com/office/drawing/2015/10/21/chartex" xmlns:cx3="http://schemas.microsoft.com/office/drawing/2016/5/9/chartex" xmlns:cx4="http://schemas.microsoft.com/office/drawing/2016/5/10/chartex" xmlns:cx5="http://schemas.microsoft.com/office/drawing/2016/5/11/chartex" xmlns:cx6="http://schemas.microsoft.com/office/drawing/2016/5/12/chartex" xmlns:cx7="http://schemas.microsoft.com/office/drawing/2016/5/13/chartex" xmlns:cx8="http://schemas.microsoft.com/office/drawing/2016/5/14/chartex" xmlns:mc="http://schemas.openxmlformats.org/markup-compatibility/2006" xmlns:aink="http://schemas.microsoft.com/office/drawing/2016/ink" xmlns:am3d="http://schemas.microsoft.com/office/drawing/2017/model3d" xmlns:o="urn:schemas-microsoft-com:office:office" xmlns:oel="http://schemas.microsoft.com/office/2019/extlst" xmlns:r="http://schemas.openxmlformats.org/officeDocument/2006/relationships" xmlns:m="http://schemas.openxmlformats.org/officeDocument/2006/math" xmlns:v="urn:schemas-microsoft-com:vml" xmlns:wp14="http://schemas.microsoft.com/office/word/2010/wordprocessingDrawing" xmlns:wp="http://schemas.openxmlformats.org/drawingml/2006/wordprocessingDrawing" xmlns:w10="urn:schemas-microsoft-com:office:word" xmlns:w="http://schemas.openxmlformats.org/wordprocessingml/2006/main" xmlns:w14="http://schemas.microsoft.com/office/word/2010/wordml" xmlns:w15="http://schemas.microsoft.com/office/word/2012/wordml" xmlns:w16cex="http://schemas.microsoft.com/office/word/2018/wordml/cex" xmlns:w16cid="http://schemas.microsoft.com/office/word/2016/wordml/cid" xmlns:w16="http://schemas.microsoft.com/office/word/2018/wordml" xmlns:w16du="http://schemas.microsoft.com/office/word/2023/wordml/word16du" xmlns:w16sdtdh="http://schemas.microsoft.com/office/word/2020/wordml/sdtdatahash" xmlns:w16sdtfl="http://schemas.microsoft.com/office/word/2024/wordml/sdtformatlock" xmlns:w16se="http://schemas.microsoft.com/office/word/2015/wordml/symex" xmlns:wpg="http://schemas.microsoft.com/office/word/2010/wordprocessingGroup" xmlns:wpi="http://schemas.microsoft.com/office/word/2010/wordprocessingInk" xmlns:wne="http://schemas.microsoft.com/office/word/2006/wordml" xmlns:wps="http://schemas.microsoft.com/office/word/2010/wordprocessingShape" mc:Ignorable="w14 w15 w16se w16cid w16 w16cex w16sdtdh w16sdtfl w16du wp14">
+  <w:p>
+    <w:pPr>
       <w:tabs>
         <w:tab w:val="center" w:pos="4680"/>
         <w:tab w:val="right" w:pos="9360"/>
@@ -781,8 +796,18 @@
         <w:sz w:val="16"/>
         <w:szCs w:val="16"/>
       </w:rPr>
-      <w:t>Website: www.thenudge.org, Email: pnc@thenudge.org</w:t>
+      <w:t>Website: www.thenudge.org</w:t>
     </w:r>
+  </w:p>
+</w:ftr>
+</file>
+
+<file path=word/footer3.xml><?xml version="1.0" encoding="utf-8"?>
+<w:ftr xmlns:wpc="http://schemas.microsoft.com/office/word/2010/wordprocessingCanvas" xmlns:cx="http://schemas.microsoft.com/office/drawing/2014/chartex" xmlns:cx1="http://schemas.microsoft.com/office/drawing/2015/9/8/chartex" xmlns:cx2="http://schemas.microsoft.com/office/drawing/2015/10/21/chartex" xmlns:cx3="http://schemas.microsoft.com/office/drawing/2016/5/9/chartex" xmlns:cx4="http://schemas.microsoft.com/office/drawing/2016/5/10/chartex" xmlns:cx5="http://schemas.microsoft.com/office/drawing/2016/5/11/chartex" xmlns:cx6="http://schemas.microsoft.com/office/drawing/2016/5/12/chartex" xmlns:cx7="http://schemas.microsoft.com/office/drawing/2016/5/13/chartex" xmlns:cx8="http://schemas.microsoft.com/office/drawing/2016/5/14/chartex" xmlns:mc="http://schemas.openxmlformats.org/markup-compatibility/2006" xmlns:aink="http://schemas.microsoft.com/office/drawing/2016/ink" xmlns:am3d="http://schemas.microsoft.com/office/drawing/2017/model3d" xmlns:o="urn:schemas-microsoft-com:office:office" xmlns:oel="http://schemas.microsoft.com/office/2019/extlst" xmlns:r="http://schemas.openxmlformats.org/officeDocument/2006/relationships" xmlns:m="http://schemas.openxmlformats.org/officeDocument/2006/math" xmlns:v="urn:schemas-microsoft-com:vml" xmlns:wp14="http://schemas.microsoft.com/office/word/2010/wordprocessingDrawing" xmlns:wp="http://schemas.openxmlformats.org/drawingml/2006/wordprocessingDrawing" xmlns:w10="urn:schemas-microsoft-com:office:word" xmlns:w="http://schemas.openxmlformats.org/wordprocessingml/2006/main" xmlns:w14="http://schemas.microsoft.com/office/word/2010/wordml" xmlns:w15="http://schemas.microsoft.com/office/word/2012/wordml" xmlns:w16cex="http://schemas.microsoft.com/office/word/2018/wordml/cex" xmlns:w16cid="http://schemas.microsoft.com/office/word/2016/wordml/cid" xmlns:w16="http://schemas.microsoft.com/office/word/2018/wordml" xmlns:w16du="http://schemas.microsoft.com/office/word/2023/wordml/word16du" xmlns:w16sdtdh="http://schemas.microsoft.com/office/word/2020/wordml/sdtdatahash" xmlns:w16sdtfl="http://schemas.microsoft.com/office/word/2024/wordml/sdtformatlock" xmlns:w16se="http://schemas.microsoft.com/office/word/2015/wordml/symex" xmlns:wpg="http://schemas.microsoft.com/office/word/2010/wordprocessingGroup" xmlns:wpi="http://schemas.microsoft.com/office/word/2010/wordprocessingInk" xmlns:wne="http://schemas.microsoft.com/office/word/2006/wordml" xmlns:wps="http://schemas.microsoft.com/office/word/2010/wordprocessingShape" mc:Ignorable="w14 w15 w16se w16cid w16 w16cex w16sdtdh w16sdtfl w16du wp14">
+  <w:p>
+    <w:pPr>
+      <w:pStyle w:val="Footer"/>
+    </w:pPr>
   </w:p>
 </w:ftr>
 </file>
@@ -816,6 +841,16 @@
 <w:hdr xmlns:wpc="http://schemas.microsoft.com/office/word/2010/wordprocessingCanvas" xmlns:cx="http://schemas.microsoft.com/office/drawing/2014/chartex" xmlns:cx1="http://schemas.microsoft.com/office/drawing/2015/9/8/chartex" xmlns:cx2="http://schemas.microsoft.com/office/drawing/2015/10/21/chartex" xmlns:cx3="http://schemas.microsoft.com/office/drawing/2016/5/9/chartex" xmlns:cx4="http://schemas.microsoft.com/office/drawing/2016/5/10/chartex" xmlns:cx5="http://schemas.microsoft.com/office/drawing/2016/5/11/chartex" xmlns:cx6="http://schemas.microsoft.com/office/drawing/2016/5/12/chartex" xmlns:cx7="http://schemas.microsoft.com/office/drawing/2016/5/13/chartex" xmlns:cx8="http://schemas.microsoft.com/office/drawing/2016/5/14/chartex" xmlns:mc="http://schemas.openxmlformats.org/markup-compatibility/2006" xmlns:aink="http://schemas.microsoft.com/office/drawing/2016/ink" xmlns:am3d="http://schemas.microsoft.com/office/drawing/2017/model3d" xmlns:o="urn:schemas-microsoft-com:office:office" xmlns:oel="http://schemas.microsoft.com/office/2019/extlst" xmlns:r="http://schemas.openxmlformats.org/officeDocument/2006/relationships" xmlns:m="http://schemas.openxmlformats.org/officeDocument/2006/math" xmlns:v="urn:schemas-microsoft-com:vml" xmlns:wp14="http://schemas.microsoft.com/office/word/2010/wordprocessingDrawing" xmlns:wp="http://schemas.openxmlformats.org/drawingml/2006/wordprocessingDrawing" xmlns:w10="urn:schemas-microsoft-com:office:word" xmlns:w="http://schemas.openxmlformats.org/wordprocessingml/2006/main" xmlns:w14="http://schemas.microsoft.com/office/word/2010/wordml" xmlns:w15="http://schemas.microsoft.com/office/word/2012/wordml" xmlns:w16cex="http://schemas.microsoft.com/office/word/2018/wordml/cex" xmlns:w16cid="http://schemas.microsoft.com/office/word/2016/wordml/cid" xmlns:w16="http://schemas.microsoft.com/office/word/2018/wordml" xmlns:w16du="http://schemas.microsoft.com/office/word/2023/wordml/word16du" xmlns:w16sdtdh="http://schemas.microsoft.com/office/word/2020/wordml/sdtdatahash" xmlns:w16sdtfl="http://schemas.microsoft.com/office/word/2024/wordml/sdtformatlock" xmlns:w16se="http://schemas.microsoft.com/office/word/2015/wordml/symex" xmlns:wpg="http://schemas.microsoft.com/office/word/2010/wordprocessingGroup" xmlns:wpi="http://schemas.microsoft.com/office/word/2010/wordprocessingInk" xmlns:wne="http://schemas.microsoft.com/office/word/2006/wordml" xmlns:wps="http://schemas.microsoft.com/office/word/2010/wordprocessingShape" mc:Ignorable="w14 w15 w16se w16cid w16 w16cex w16sdtdh w16sdtfl w16du wp14">
   <w:p>
     <w:pPr>
+      <w:pStyle w:val="Header"/>
+    </w:pPr>
+  </w:p>
+</w:hdr>
+</file>
+
+<file path=word/header2.xml><?xml version="1.0" encoding="utf-8"?>
+<w:hdr xmlns:wpc="http://schemas.microsoft.com/office/word/2010/wordprocessingCanvas" xmlns:cx="http://schemas.microsoft.com/office/drawing/2014/chartex" xmlns:cx1="http://schemas.microsoft.com/office/drawing/2015/9/8/chartex" xmlns:cx2="http://schemas.microsoft.com/office/drawing/2015/10/21/chartex" xmlns:cx3="http://schemas.microsoft.com/office/drawing/2016/5/9/chartex" xmlns:cx4="http://schemas.microsoft.com/office/drawing/2016/5/10/chartex" xmlns:cx5="http://schemas.microsoft.com/office/drawing/2016/5/11/chartex" xmlns:cx6="http://schemas.microsoft.com/office/drawing/2016/5/12/chartex" xmlns:cx7="http://schemas.microsoft.com/office/drawing/2016/5/13/chartex" xmlns:cx8="http://schemas.microsoft.com/office/drawing/2016/5/14/chartex" xmlns:mc="http://schemas.openxmlformats.org/markup-compatibility/2006" xmlns:aink="http://schemas.microsoft.com/office/drawing/2016/ink" xmlns:am3d="http://schemas.microsoft.com/office/drawing/2017/model3d" xmlns:o="urn:schemas-microsoft-com:office:office" xmlns:oel="http://schemas.microsoft.com/office/2019/extlst" xmlns:r="http://schemas.openxmlformats.org/officeDocument/2006/relationships" xmlns:m="http://schemas.openxmlformats.org/officeDocument/2006/math" xmlns:v="urn:schemas-microsoft-com:vml" xmlns:wp14="http://schemas.microsoft.com/office/word/2010/wordprocessingDrawing" xmlns:wp="http://schemas.openxmlformats.org/drawingml/2006/wordprocessingDrawing" xmlns:w10="urn:schemas-microsoft-com:office:word" xmlns:w="http://schemas.openxmlformats.org/wordprocessingml/2006/main" xmlns:w14="http://schemas.microsoft.com/office/word/2010/wordml" xmlns:w15="http://schemas.microsoft.com/office/word/2012/wordml" xmlns:w16cex="http://schemas.microsoft.com/office/word/2018/wordml/cex" xmlns:w16cid="http://schemas.microsoft.com/office/word/2016/wordml/cid" xmlns:w16="http://schemas.microsoft.com/office/word/2018/wordml" xmlns:w16du="http://schemas.microsoft.com/office/word/2023/wordml/word16du" xmlns:w16sdtdh="http://schemas.microsoft.com/office/word/2020/wordml/sdtdatahash" xmlns:w16sdtfl="http://schemas.microsoft.com/office/word/2024/wordml/sdtformatlock" xmlns:w16se="http://schemas.microsoft.com/office/word/2015/wordml/symex" xmlns:wpg="http://schemas.microsoft.com/office/word/2010/wordprocessingGroup" xmlns:wpi="http://schemas.microsoft.com/office/word/2010/wordprocessingInk" xmlns:wne="http://schemas.microsoft.com/office/word/2006/wordml" xmlns:wps="http://schemas.microsoft.com/office/word/2010/wordprocessingShape" mc:Ignorable="w14 w15 w16se w16cid w16 w16cex w16sdtdh w16sdtfl w16du wp14">
+  <w:p>
+    <w:pPr>
       <w:tabs>
         <w:tab w:val="center" w:pos="4680"/>
         <w:tab w:val="right" w:pos="9360"/>
@@ -830,32 +865,34 @@
     </w:pPr>
     <w:r>
       <w:rPr>
+        <w:rFonts w:ascii="Montserrat Light" w:eastAsia="Montserrat Light" w:hAnsi="Montserrat Light" w:cs="Montserrat Light"/>
+        <w:color w:val="434343"/>
+        <w:sz w:val="28"/>
+        <w:szCs w:val="28"/>
+      </w:rPr>
+      <w:t xml:space="preserve">                                                                                       </w:t>
+    </w:r>
+    <w:r>
+      <w:rPr>
         <w:noProof/>
       </w:rPr>
       <w:drawing>
-        <wp:anchor distT="0" distB="0" distL="114300" distR="114300" simplePos="0" relativeHeight="251658240" behindDoc="0" locked="0" layoutInCell="1" hidden="0" allowOverlap="1" wp14:anchorId="3A4A6533" wp14:editId="53193403">
-          <wp:simplePos x="0" y="0"/>
-          <wp:positionH relativeFrom="column">
-            <wp:posOffset>3752850</wp:posOffset>
-          </wp:positionH>
-          <wp:positionV relativeFrom="paragraph">
-            <wp:posOffset>-285746</wp:posOffset>
-          </wp:positionV>
-          <wp:extent cx="2232025" cy="628650"/>
+        <wp:inline distT="0" distB="0" distL="0" distR="0" wp14:anchorId="0602CA3E" wp14:editId="34157235">
+          <wp:extent cx="1933333" cy="295238"/>
           <wp:effectExtent l="0" t="0" r="0" b="0"/>
-          <wp:wrapSquare wrapText="bothSides" distT="0" distB="0" distL="114300" distR="114300"/>
-          <wp:docPr id="424958483" name="image1.png"/>
-          <wp:cNvGraphicFramePr/>
+          <wp:docPr id="574768118" name="Picture 1"/>
+          <wp:cNvGraphicFramePr>
+            <a:graphicFrameLocks xmlns:a="http://schemas.openxmlformats.org/drawingml/2006/main" noChangeAspect="1"/>
+          </wp:cNvGraphicFramePr>
           <a:graphic xmlns:a="http://schemas.openxmlformats.org/drawingml/2006/main">
             <a:graphicData uri="http://schemas.openxmlformats.org/drawingml/2006/picture">
               <pic:pic xmlns:pic="http://schemas.openxmlformats.org/drawingml/2006/picture">
                 <pic:nvPicPr>
-                  <pic:cNvPr id="0" name="image1.png"/>
-                  <pic:cNvPicPr preferRelativeResize="0"/>
+                  <pic:cNvPr id="574768118" name=""/>
+                  <pic:cNvPicPr/>
                 </pic:nvPicPr>
                 <pic:blipFill>
                   <a:blip r:embed="rId1"/>
-                  <a:srcRect l="-46789" b="-19778"/>
                   <a:stretch>
                     <a:fillRect/>
                   </a:stretch>
@@ -863,17 +900,16 @@
                 <pic:spPr>
                   <a:xfrm>
                     <a:off x="0" y="0"/>
-                    <a:ext cx="2232025" cy="628650"/>
+                    <a:ext cx="1933333" cy="295238"/>
                   </a:xfrm>
                   <a:prstGeom prst="rect">
                     <a:avLst/>
                   </a:prstGeom>
-                  <a:ln/>
                 </pic:spPr>
               </pic:pic>
             </a:graphicData>
           </a:graphic>
-        </wp:anchor>
+        </wp:inline>
       </w:drawing>
     </w:r>
   </w:p>
@@ -887,9 +923,34 @@
       <w:rPr>
         <w:rFonts w:ascii="Montserrat Light" w:eastAsia="Montserrat Light" w:hAnsi="Montserrat Light" w:cs="Montserrat Light"/>
         <w:color w:val="434343"/>
+        <w:sz w:val="28"/>
+        <w:szCs w:val="28"/>
+      </w:rPr>
+    </w:pPr>
+  </w:p>
+  <w:p>
+    <w:pPr>
+      <w:tabs>
+        <w:tab w:val="center" w:pos="4680"/>
+        <w:tab w:val="right" w:pos="9360"/>
+      </w:tabs>
+      <w:spacing w:after="0" w:line="240" w:lineRule="auto"/>
+      <w:rPr>
+        <w:rFonts w:ascii="Montserrat Light" w:eastAsia="Montserrat Light" w:hAnsi="Montserrat Light" w:cs="Montserrat Light"/>
+        <w:color w:val="434343"/>
         <w:sz w:val="40"/>
         <w:szCs w:val="40"/>
       </w:rPr>
+    </w:pPr>
+  </w:p>
+</w:hdr>
+</file>
+
+<file path=word/header3.xml><?xml version="1.0" encoding="utf-8"?>
+<w:hdr xmlns:wpc="http://schemas.microsoft.com/office/word/2010/wordprocessingCanvas" xmlns:cx="http://schemas.microsoft.com/office/drawing/2014/chartex" xmlns:cx1="http://schemas.microsoft.com/office/drawing/2015/9/8/chartex" xmlns:cx2="http://schemas.microsoft.com/office/drawing/2015/10/21/chartex" xmlns:cx3="http://schemas.microsoft.com/office/drawing/2016/5/9/chartex" xmlns:cx4="http://schemas.microsoft.com/office/drawing/2016/5/10/chartex" xmlns:cx5="http://schemas.microsoft.com/office/drawing/2016/5/11/chartex" xmlns:cx6="http://schemas.microsoft.com/office/drawing/2016/5/12/chartex" xmlns:cx7="http://schemas.microsoft.com/office/drawing/2016/5/13/chartex" xmlns:cx8="http://schemas.microsoft.com/office/drawing/2016/5/14/chartex" xmlns:mc="http://schemas.openxmlformats.org/markup-compatibility/2006" xmlns:aink="http://schemas.microsoft.com/office/drawing/2016/ink" xmlns:am3d="http://schemas.microsoft.com/office/drawing/2017/model3d" xmlns:o="urn:schemas-microsoft-com:office:office" xmlns:oel="http://schemas.microsoft.com/office/2019/extlst" xmlns:r="http://schemas.openxmlformats.org/officeDocument/2006/relationships" xmlns:m="http://schemas.openxmlformats.org/officeDocument/2006/math" xmlns:v="urn:schemas-microsoft-com:vml" xmlns:wp14="http://schemas.microsoft.com/office/word/2010/wordprocessingDrawing" xmlns:wp="http://schemas.openxmlformats.org/drawingml/2006/wordprocessingDrawing" xmlns:w10="urn:schemas-microsoft-com:office:word" xmlns:w="http://schemas.openxmlformats.org/wordprocessingml/2006/main" xmlns:w14="http://schemas.microsoft.com/office/word/2010/wordml" xmlns:w15="http://schemas.microsoft.com/office/word/2012/wordml" xmlns:w16cex="http://schemas.microsoft.com/office/word/2018/wordml/cex" xmlns:w16cid="http://schemas.microsoft.com/office/word/2016/wordml/cid" xmlns:w16="http://schemas.microsoft.com/office/word/2018/wordml" xmlns:w16du="http://schemas.microsoft.com/office/word/2023/wordml/word16du" xmlns:w16sdtdh="http://schemas.microsoft.com/office/word/2020/wordml/sdtdatahash" xmlns:w16sdtfl="http://schemas.microsoft.com/office/word/2024/wordml/sdtformatlock" xmlns:w16se="http://schemas.microsoft.com/office/word/2015/wordml/symex" xmlns:wpg="http://schemas.microsoft.com/office/word/2010/wordprocessingGroup" xmlns:wpi="http://schemas.microsoft.com/office/word/2010/wordprocessingInk" xmlns:wne="http://schemas.microsoft.com/office/word/2006/wordml" xmlns:wps="http://schemas.microsoft.com/office/word/2010/wordprocessingShape" mc:Ignorable="w14 w15 w16se w16cid w16 w16cex w16sdtdh w16sdtfl w16du wp14">
+  <w:p>
+    <w:pPr>
+      <w:pStyle w:val="Header"/>
     </w:pPr>
   </w:p>
 </w:hdr>

</xml_diff>